<commit_message>
Rename repository to citeseq-protein-access
</commit_message>
<xml_diff>
--- a/results/manuscript_submission_revision/manuscript/CITEseq_Protein_Access_Model_Gains.docx
+++ b/results/manuscript_submission_revision/manuscript/CITEseq_Protein_Access_Model_Gains.docx
@@ -4127,7 +4127,7 @@
           <w:i w:val="0"/>
           <w:sz w:val="18"/>
         </w:rPr>
-        <w:t>. Environment files: `environment.yml`, `requirements.txt`. Code: https://github.com/Jizhuy/robust-multiomics-integration. An immutable archival release and DOI will accompany the submitted version.</w:t>
+        <w:t>. Environment files: `environment.yml`, `requirements.txt`. Code: https://github.com/Jizhuy/citeseq-protein-access. An immutable archival release and DOI will accompany the submitted version.</w:t>
       </w:r>
     </w:p>
     <w:p>
@@ -4209,7 +4209,7 @@
           <w:i w:val="0"/>
           <w:sz w:val="20"/>
         </w:rPr>
-        <w:t>Analysis code and reproducible workflows are publicly available at https://github.com/Jizhuy/robust-multiomics-integration.git. An immutable archival release and DOI will accompany the submitted version of the manuscript.</w:t>
+        <w:t>Analysis code and reproducible workflows are publicly available at https://github.com/Jizhuy/citeseq-protein-access.git. An immutable archival release and DOI will accompany the submitted version of the manuscript.</w:t>
       </w:r>
     </w:p>
     <w:p>

</xml_diff>